<commit_message>
feat: add camera permission and update file templates
- Request CAMERA permission in manifest
- Standardize new document templates to ODF formats
- Fix new document state restoration in MainActivity
- Update default filenames for Cellina spreadsheets
</commit_message>
<xml_diff>
--- a/tests/inky/Sample-5.docx
+++ b/tests/inky/Sample-5.docx
@@ -44,7 +44,7 @@
                       <a:picLocks noChangeAspect="1"/>
                       <a:extLst>
                         <a:ext uri="sm">
-                          <sm:smNativeData xmlns:sm="sm" xmlns:w="http://schemas.openxmlformats.org/wordprocessingml/2006/main" xmlns:w10="urn:schemas-microsoft-com:office:word" xmlns:v="urn:schemas-microsoft-com:vml" xmlns:o="urn:schemas-microsoft-com:office:office" xmlns="" val="SMDATA_17_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"/>
+                          <sm:smNativeData xmlns="" xmlns:o="urn:schemas-microsoft-com:office:office" xmlns:v="urn:schemas-microsoft-com:vml" xmlns:w10="urn:schemas-microsoft-com:office:word" xmlns:w="http://schemas.openxmlformats.org/wordprocessingml/2006/main" xmlns:sm="sm" val="SMDATA_17_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"/>
                         </a:ext>
                       </a:extLst>
                     </pic:cNvPicPr>
@@ -787,10 +787,7 @@
       </w:r>
       <w:proofErr w:type="spellEnd"/>
       <w:r>
-        <w:t xml:space="preserve">, 2020). Namun, </w:t>
-      </w:r>
-      <w:r>
-        <w:t xml:space="preserve">analisis </w:t>
+        <w:t xml:space="preserve">, 2020). Namun, analisis </w:t>
       </w:r>
       <w:proofErr w:type="spellStart"/>
       <w:r>
@@ -882,10 +879,7 @@
       </w:r>
       <w:proofErr w:type="spellEnd"/>
       <w:r>
-        <w:t>, 2019). Dekonstruksi taksonomi ini memicu perubahan paradigma dalam pembe</w:t>
-      </w:r>
-      <w:r>
-        <w:t xml:space="preserve">lajaran biologi modern, di mana domain </w:t>
+        <w:t xml:space="preserve">, 2019). Dekonstruksi taksonomi ini memicu perubahan paradigma dalam pembelajaran biologi modern, di mana domain </w:t>
       </w:r>
       <w:proofErr w:type="spellStart"/>
       <w:r>
@@ -1118,10 +1112,7 @@
       </w:r>
       <w:proofErr w:type="spellEnd"/>
       <w:r>
-        <w:t>, 1998). Kelompok ini menopang jaring-jaring makanan akuatik dan bertanggung jawab atas penyerapan karbon d</w:t>
-      </w:r>
-      <w:r>
-        <w:t>ioksida (CO</w:t>
+        <w:t>, 1998). Kelompok ini menopang jaring-jaring makanan akuatik dan bertanggung jawab atas penyerapan karbon dioksida (CO</w:t>
       </w:r>
       <w:r>
         <w:rPr>
@@ -1202,10 +1193,7 @@
       </w:r>
       <w:proofErr w:type="spellEnd"/>
       <w:r>
-        <w:t xml:space="preserve"> sensitif terhadap perubahan </w:t>
-      </w:r>
-      <w:r>
-        <w:t>kualitas lingkungan, tingkat pencemaran air, dan dinamika iklim global (</w:t>
+        <w:t xml:space="preserve"> sensitif terhadap perubahan kualitas lingkungan, tingkat pencemaran air, dan dinamika iklim global (</w:t>
       </w:r>
       <w:proofErr w:type="spellStart"/>
       <w:r>
@@ -1294,10 +1282,7 @@
       </w:r>
       <w:proofErr w:type="spellEnd"/>
       <w:r>
-        <w:t>) dengan jamur sejati</w:t>
-      </w:r>
-      <w:r>
-        <w:t xml:space="preserve"> (Fungi) (Agustina &amp; Indana, 2021; </w:t>
+        <w:t xml:space="preserve">) dengan jamur sejati (Fungi) (Agustina &amp; Indana, 2021; </w:t>
       </w:r>
       <w:proofErr w:type="spellStart"/>
       <w:r>
@@ -1305,7 +1290,39 @@
       </w:r>
       <w:proofErr w:type="spellEnd"/>
       <w:r>
-        <w:t xml:space="preserve"> </w:t>
+        <w:t xml:space="preserve"> et </w:t>
+      </w:r>
+      <w:proofErr w:type="spellStart"/>
+      <w:r>
+        <w:t>al.</w:t>
+      </w:r>
+      <w:proofErr w:type="spellEnd"/>
+      <w:r>
+        <w:t xml:space="preserve">, 2022). Pembelajaran IPA yang cenderung dominan hafalan istilah latin tanpa pendekatan eksplorasi kontekstual menyebabkan tingkat penguasaan konsep siswa terhadap </w:t>
+      </w:r>
+      <w:proofErr w:type="spellStart"/>
+      <w:r>
+        <w:t>biodiversitas</w:t>
+      </w:r>
+      <w:proofErr w:type="spellEnd"/>
+      <w:r>
+        <w:t xml:space="preserve"> </w:t>
+      </w:r>
+      <w:proofErr w:type="spellStart"/>
+      <w:r>
+        <w:t>eukariotik</w:t>
+      </w:r>
+      <w:proofErr w:type="spellEnd"/>
+      <w:r>
+        <w:t xml:space="preserve"> bersel tunggal ini tergolong rendah, dengan keluhan tingkat kesulitan materi mencapai 76,7% (Fauzi &amp; </w:t>
+      </w:r>
+      <w:proofErr w:type="spellStart"/>
+      <w:r>
+        <w:t>Mitalistiani</w:t>
+      </w:r>
+      <w:proofErr w:type="spellEnd"/>
+      <w:r>
+        <w:t xml:space="preserve">, 2018; Suci </w:t>
       </w:r>
       <w:proofErr w:type="spellStart"/>
       <w:r>
@@ -1321,51 +1338,12 @@
       </w:r>
       <w:proofErr w:type="spellEnd"/>
       <w:r>
-        <w:t xml:space="preserve">, 2022). Pembelajaran IPA yang cenderung dominan hafalan istilah latin tanpa pendekatan eksplorasi kontekstual menyebabkan tingkat penguasaan konsep siswa terhadap </w:t>
-      </w:r>
-      <w:proofErr w:type="spellStart"/>
-      <w:r>
-        <w:t>biodiversitas</w:t>
-      </w:r>
-      <w:proofErr w:type="spellEnd"/>
-      <w:r>
-        <w:t xml:space="preserve"> </w:t>
-      </w:r>
-      <w:proofErr w:type="spellStart"/>
-      <w:r>
-        <w:t>eukariotik</w:t>
-      </w:r>
-      <w:proofErr w:type="spellEnd"/>
-      <w:r>
-        <w:t xml:space="preserve"> bersel tunggal ini tergolong rendah, dengan keluhan tingkat kesulitan materi mencapai 76,7% (Fauzi &amp; </w:t>
-      </w:r>
-      <w:proofErr w:type="spellStart"/>
-      <w:r>
-        <w:t>Mitalistiani</w:t>
-      </w:r>
-      <w:proofErr w:type="spellEnd"/>
-      <w:r>
-        <w:t xml:space="preserve">, 2018; Suci </w:t>
-      </w:r>
-      <w:proofErr w:type="spellStart"/>
-      <w:r>
-        <w:t>et</w:t>
-      </w:r>
-      <w:proofErr w:type="spellEnd"/>
-      <w:r>
-        <w:t xml:space="preserve"> </w:t>
-      </w:r>
-      <w:proofErr w:type="spellStart"/>
-      <w:r>
-        <w:t>al.</w:t>
-      </w:r>
-      <w:proofErr w:type="spellEnd"/>
-      <w:r>
         <w:t>, 2022).</w:t>
       </w:r>
     </w:p>
     <w:p>
       <w:r>
+        <w:lastRenderedPageBreak/>
         <w:t>​</w:t>
       </w:r>
       <w:r>
@@ -1410,10 +1388,7 @@
       </w:r>
       <w:proofErr w:type="spellEnd"/>
       <w:r>
-        <w:t>, 2017). Oleh karena itu, makalah ini disusun untuk mengkaji secara sist</w:t>
-      </w:r>
-      <w:r>
-        <w:t>ematis mengenai taksonomi, karakteristik ultrastruktur, serta peranan fungsional Protista dalam ekosistem akuatik dan biosfer secara menyeluruh.</w:t>
+        <w:t>, 2017). Oleh karena itu, makalah ini disusun untuk mengkaji secara sistematis mengenai taksonomi, karakteristik ultrastruktur, serta peranan fungsional Protista dalam ekosistem akuatik dan biosfer secara menyeluruh.</w:t>
       </w:r>
     </w:p>
     <w:p>
@@ -1597,6 +1572,7 @@
       </w:pPr>
       <w:bookmarkStart w:id="6" w:name="_TOC000008"/>
       <w:r>
+        <w:lastRenderedPageBreak/>
         <w:br/>
         <w:t>Pembahasan</w:t>
       </w:r>
@@ -1739,10 +1715,7 @@
       </w:r>
       <w:proofErr w:type="spellEnd"/>
       <w:r>
-        <w:t xml:space="preserve"> uniseluler hingga mencapai</w:t>
-      </w:r>
-      <w:r>
-        <w:t xml:space="preserve"> beberapa puluh meter pada alga cokelat multiseluler (kelp) seperti </w:t>
+        <w:t xml:space="preserve"> uniseluler hingga mencapai beberapa puluh meter pada alga cokelat multiseluler (kelp) seperti </w:t>
       </w:r>
       <w:proofErr w:type="spellStart"/>
       <w:r>
@@ -2321,7 +2294,11 @@
       </w:r>
       <w:proofErr w:type="spellEnd"/>
       <w:r>
-        <w:t xml:space="preserve"> primer maupun sekunder (Lee, 2018). Pada </w:t>
+        <w:t xml:space="preserve"> primer maupun sekunder </w:t>
+      </w:r>
+      <w:r>
+        <w:lastRenderedPageBreak/>
+        <w:t xml:space="preserve">(Lee, 2018). Pada </w:t>
       </w:r>
       <w:proofErr w:type="spellStart"/>
       <w:r>
@@ -2345,10 +2322,7 @@
       </w:r>
       <w:proofErr w:type="spellEnd"/>
       <w:r>
-        <w:t xml:space="preserve"> (seperti Diatom dan Alga Cokelat), kloroplas dikelilingi oleh 3 hingga 4 lapis membran yang mengandung pigmen </w:t>
-      </w:r>
-      <w:r>
-        <w:t xml:space="preserve">klorofil a, c, serta </w:t>
+        <w:t xml:space="preserve"> (seperti Diatom dan Alga Cokelat), kloroplas dikelilingi oleh 3 hingga 4 lapis membran yang mengandung pigmen klorofil a, c, serta </w:t>
       </w:r>
       <w:proofErr w:type="spellStart"/>
       <w:r>
@@ -2780,10 +2754,7 @@
       </w:r>
       <w:proofErr w:type="spellEnd"/>
       <w:r>
-        <w:t>, 2017). Setelah terbentuk, vakuola makanan berfusi dengan lisosom primer yang membawa enzim-enzim hidrolitik asam untuk memecah makromolekul. Sisa pencernaan yang tidak tercerna selanjutny</w:t>
-      </w:r>
-      <w:r>
-        <w:t xml:space="preserve">a diekskresikan melalui struktur ekskresi khusus yang dinamakan </w:t>
+        <w:t xml:space="preserve">, 2017). Setelah terbentuk, vakuola makanan berfusi dengan lisosom primer yang membawa enzim-enzim hidrolitik asam untuk memecah makromolekul. Sisa pencernaan yang tidak tercerna selanjutnya diekskresikan melalui struktur ekskresi khusus yang dinamakan </w:t>
       </w:r>
       <w:proofErr w:type="spellStart"/>
       <w:r>
@@ -3086,10 +3057,7 @@
       </w:r>
       <w:proofErr w:type="spellEnd"/>
       <w:r>
-        <w:t xml:space="preserve"> berukuran lebih panjan</w:t>
-      </w:r>
-      <w:r>
-        <w:t xml:space="preserve">g dan berjumlah satu hingga beberapa pasang (seperti pada </w:t>
+        <w:t xml:space="preserve"> berukuran lebih panjang dan berjumlah satu hingga beberapa pasang (seperti pada </w:t>
       </w:r>
       <w:proofErr w:type="spellStart"/>
       <w:r>
@@ -3221,7 +3189,11 @@
       </w:r>
       <w:proofErr w:type="spellEnd"/>
       <w:r>
-        <w:t xml:space="preserve"> pada sitoplasma bagian luar (ektoplasma) dan bagian dalam (endoplasma) (</w:t>
+        <w:t xml:space="preserve"> pada sitoplasma bagian </w:t>
+      </w:r>
+      <w:r>
+        <w:lastRenderedPageBreak/>
+        <w:t>luar (ektoplasma) dan bagian dalam (endoplasma) (</w:t>
       </w:r>
       <w:proofErr w:type="spellStart"/>
       <w:r>
@@ -3920,10 +3892,7 @@
       </w:r>
       <w:proofErr w:type="spellEnd"/>
       <w:r>
-        <w:t xml:space="preserve"> menunjukkan bahwa Kerajaan Protista </w:t>
-      </w:r>
-      <w:r>
-        <w:t xml:space="preserve">tradisional bersifat </w:t>
+        <w:t xml:space="preserve"> menunjukkan bahwa Kerajaan Protista tradisional bersifat </w:t>
       </w:r>
       <w:proofErr w:type="spellStart"/>
       <w:r>
@@ -4172,10 +4141,7 @@
       </w:r>
       <w:proofErr w:type="spellStart"/>
       <w:r>
-        <w:t>e</w:t>
-      </w:r>
-      <w:r>
-        <w:t>ukariot</w:t>
+        <w:t>eukariot</w:t>
       </w:r>
       <w:proofErr w:type="spellEnd"/>
       <w:r>
@@ -4219,6 +4185,7 @@
         <w:pStyle w:val="Judul3"/>
       </w:pPr>
       <w:r>
+        <w:lastRenderedPageBreak/>
         <w:t xml:space="preserve">​Keanekaragaman Taksonomi Empat </w:t>
       </w:r>
       <w:proofErr w:type="spellStart"/>
@@ -5478,7 +5445,11 @@
       </w:r>
       <w:proofErr w:type="spellEnd"/>
       <w:r>
-        <w:t xml:space="preserve"> dan asam </w:t>
+        <w:t xml:space="preserve"> dan </w:t>
+      </w:r>
+      <w:r>
+        <w:lastRenderedPageBreak/>
+        <w:t xml:space="preserve">asam </w:t>
       </w:r>
       <w:proofErr w:type="spellStart"/>
       <w:r>
@@ -6670,6 +6641,7 @@
           <w:i/>
           <w:iCs/>
         </w:rPr>
+        <w:lastRenderedPageBreak/>
         <w:t>Rhodophyta</w:t>
       </w:r>
       <w:proofErr w:type="spellEnd"/>
@@ -8009,6 +7981,7 @@
       </w:pPr>
       <w:bookmarkStart w:id="9" w:name="_TOC000011"/>
       <w:r>
+        <w:lastRenderedPageBreak/>
         <w:t>​Fungsi Ekologis dan Aplikasi Biologis dari Protista di Alam</w:t>
       </w:r>
       <w:bookmarkEnd w:id="9"/>
@@ -8298,13 +8271,7 @@
             <w:rPr>
               <w:rFonts w:ascii="Cambria Math" w:hAnsi="Cambria Math"/>
             </w:rPr>
-            <m:t xml:space="preserve">O </m:t>
-          </m:r>
-          <m:r>
-            <w:rPr>
-              <w:rFonts w:ascii="Cambria Math" w:hAnsi="Cambria Math"/>
-            </w:rPr>
-            <m:t>→</m:t>
+            <m:t>O →</m:t>
           </m:r>
           <m:d>
             <m:dPr>
@@ -8412,13 +8379,7 @@
             <w:rPr>
               <w:rFonts w:ascii="Cambria Math" w:hAnsi="Cambria Math"/>
             </w:rPr>
-            <m:t xml:space="preserve"> + </m:t>
-          </m:r>
-          <m:r>
-            <w:rPr>
-              <w:rFonts w:ascii="Cambria Math" w:hAnsi="Cambria Math"/>
-            </w:rPr>
-            <m:t>6</m:t>
+            <m:t xml:space="preserve"> + 6</m:t>
           </m:r>
           <m:sSub>
             <m:sSubPr>
@@ -8726,10 +8687,7 @@
       </w:r>
       <w:proofErr w:type="spellEnd"/>
       <w:r>
-        <w:t>, sehingga mentransfer materi orga</w:t>
-      </w:r>
-      <w:r>
-        <w:t>nik terlarut (</w:t>
+        <w:t>, sehingga mentransfer materi organik terlarut (</w:t>
       </w:r>
       <w:proofErr w:type="spellStart"/>
       <w:r>
@@ -8906,15 +8864,7 @@
       </w:r>
       <w:proofErr w:type="spellEnd"/>
       <w:r>
-        <w:t xml:space="preserve"> </w:t>
-      </w:r>
-      <w:proofErr w:type="spellStart"/>
-      <w:r>
-        <w:t>et</w:t>
-      </w:r>
-      <w:proofErr w:type="spellEnd"/>
-      <w:r>
-        <w:t xml:space="preserve"> </w:t>
+        <w:t xml:space="preserve"> et </w:t>
       </w:r>
       <w:proofErr w:type="spellStart"/>
       <w:r>
@@ -9070,6 +9020,7 @@
         <w:pStyle w:val="Judul3"/>
       </w:pPr>
       <w:r>
+        <w:lastRenderedPageBreak/>
         <w:t xml:space="preserve">​Fenomena Ekologis Negatif: Eutrofikasi dan </w:t>
       </w:r>
       <w:proofErr w:type="spellStart"/>
@@ -9388,10 +9339,7 @@
       </w:r>
       <w:proofErr w:type="spellEnd"/>
       <w:r>
-        <w:t xml:space="preserve"> ini menyebab</w:t>
-      </w:r>
-      <w:r>
-        <w:t>kan kematian massal pada biota laut seperti ikan, udang, dan terumbu karang (</w:t>
+        <w:t xml:space="preserve"> ini menyebabkan kematian massal pada biota laut seperti ikan, udang, dan terumbu karang (</w:t>
       </w:r>
       <w:proofErr w:type="spellStart"/>
       <w:r>
@@ -10084,6 +10032,7 @@
         <w:pStyle w:val="Judul4"/>
       </w:pPr>
       <w:r>
+        <w:lastRenderedPageBreak/>
         <w:t>Aplikasi Geologis dan Paleontologi Fosil</w:t>
       </w:r>
     </w:p>
@@ -11095,6 +11044,7 @@
       </w:pPr>
       <w:bookmarkStart w:id="10" w:name="_TOC000012"/>
       <w:r>
+        <w:lastRenderedPageBreak/>
         <w:br/>
         <w:t>Penutup</w:t>
       </w:r>
@@ -11180,10 +11130,7 @@
       </w:r>
       <w:proofErr w:type="spellEnd"/>
       <w:r>
-        <w:t xml:space="preserve"> dan vakuola makanan untuk fagositosis, serta organe</w:t>
-      </w:r>
-      <w:r>
-        <w:t xml:space="preserve">l lokomotif khas berupa </w:t>
+        <w:t xml:space="preserve"> dan vakuola makanan untuk fagositosis, serta organel lokomotif khas berupa </w:t>
       </w:r>
       <w:proofErr w:type="spellStart"/>
       <w:r>
@@ -11422,14 +11369,7 @@
           <w:i/>
           <w:iCs/>
         </w:rPr>
-        <w:t>Plan</w:t>
-      </w:r>
-      <w:r>
-        <w:rPr>
-          <w:i/>
-          <w:iCs/>
-        </w:rPr>
-        <w:t>tae</w:t>
+        <w:t>Plantae</w:t>
       </w:r>
       <w:proofErr w:type="spellEnd"/>
       <w:r>
@@ -11882,6 +11822,7 @@
           <w:b/>
           <w:bCs/>
         </w:rPr>
+        <w:lastRenderedPageBreak/>
         <w:t>Bagi Pendidik dan Calon Pendidik IPA</w:t>
       </w:r>
       <w:r>
@@ -12075,6 +12016,7 @@
       </w:pPr>
       <w:bookmarkStart w:id="13" w:name="_TOC000015"/>
       <w:r>
+        <w:lastRenderedPageBreak/>
         <w:t>Daftar Pustaka</w:t>
       </w:r>
       <w:bookmarkEnd w:id="13"/>
@@ -13094,6 +13036,7 @@
       </w:pPr>
       <w:proofErr w:type="spellStart"/>
       <w:r>
+        <w:lastRenderedPageBreak/>
         <w:t>Karp</w:t>
       </w:r>
       <w:proofErr w:type="spellEnd"/>
@@ -14297,10 +14240,7 @@
       <w:fldChar w:fldCharType="separate"/>
     </w:r>
     <w:r>
-      <w:t>ii</w:t>
-    </w:r>
-    <w:r>
-      <w:t>i</w:t>
+      <w:t>iii</w:t>
     </w:r>
     <w:r>
       <w:fldChar w:fldCharType="end"/>

</xml_diff>